<commit_message>
docs(sdr): reflect autonomy switch across product page + specs + xlsx
Co-Authored-By: Claude Opus 4.8 (1M context) <noreply@anthropic.com>
</commit_message>
<xml_diff>
--- a/HELIX SOFTWARES REVIEW PAGES.docx
+++ b/HELIX SOFTWARES REVIEW PAGES.docx
@@ -1651,6 +1651,16 @@
           <w:rtl/>
         </w:rPr>
         <w:t>HELIX SDR — Outbound   —   ציון כולל: 83/100</w:t>
+      </w:r>
+    </w:p>
+    <w:p>
+      <w:pPr>
+        <w:bidi/>
+        <w:spacing w:before="280" w:after="120"/>
+        <w:jc w:val="right"/>
+      </w:pPr>
+      <w:r>
+        <w:t>🆕 מתג אוטונומיה: פנייה קרה עוברת מתג — ברירת מחדל 'מאשר' (אישור אנושי), ו'אוטופיילוט' רק כ-opt-in מפורש עם risk_ack. אין שליחה קרה אוטומטית ללא הפעלה.</w:t>
       </w:r>
     </w:p>
     <w:p>

</xml_diff>

<commit_message>
docs(ops): reflect autonomy switch across product page + specs + xlsx
Co-Authored-By: Claude Opus 4.8 (1M context) <noreply@anthropic.com>
</commit_message>
<xml_diff>
--- a/HELIX SOFTWARES REVIEW PAGES.docx
+++ b/HELIX SOFTWARES REVIEW PAGES.docx
@@ -409,6 +409,16 @@
           <w:rtl/>
         </w:rPr>
         <w:t>HELIX OPS — Marketing Ops   —   ציון כולל: 82/100</w:t>
+      </w:r>
+    </w:p>
+    <w:p>
+      <w:pPr>
+        <w:bidi/>
+        <w:spacing w:before="280" w:after="120"/>
+        <w:jc w:val="right"/>
+      </w:pPr>
+      <w:r>
+        <w:t>🆕 מתג אוטונומיה אחיד (המלץ/אשר/אוטופיילוט) חוצה performance+engagement+radar. רדאר לידים יכול לפרסם באוטופיילוט רק כ-opt-in מפורש; ברירת מחדל בטוחה.</w:t>
       </w:r>
     </w:p>
     <w:p>

</xml_diff>

<commit_message>
docs(rank): reflect autonomy publish-behind-switch across page + specs + xlsx
Co-Authored-By: Claude Opus 4.8 (1M context) <noreply@anthropic.com>
</commit_message>
<xml_diff>
--- a/HELIX SOFTWARES REVIEW PAGES.docx
+++ b/HELIX SOFTWARES REVIEW PAGES.docx
@@ -2292,6 +2292,16 @@
           <w:rtl/>
         </w:rPr>
         <w:t>HELIX RANK — SEO/GEO   —   ציון כולל: 86/100</w:t>
+      </w:r>
+    </w:p>
+    <w:p>
+      <w:pPr>
+        <w:bidi/>
+        <w:spacing w:before="280" w:after="120"/>
+        <w:jc w:val="right"/>
+      </w:pPr>
+      <w:r>
+        <w:t>🆕 מתג אוטונומיה: ה-act loop יכול לפרסם חי ל-CMS רק כ-opt-in מפורש (rank.publish=autopilot+risk_ack). ברירת מחדל: תוכן נשאר מוכן-לפרסום, ללא go-live מפתיע.</w:t>
       </w:r>
     </w:p>
     <w:p>

</xml_diff>

<commit_message>
docs(crm): reflect autonomy stalled-deal detector across CRM spec + xlsx
Co-Authored-By: Claude Opus 4.8 (1M context) <noreply@anthropic.com>
</commit_message>
<xml_diff>
--- a/HELIX SOFTWARES REVIEW PAGES.docx
+++ b/HELIX SOFTWARES REVIEW PAGES.docx
@@ -6685,6 +6685,16 @@
           <w:rtl/>
         </w:rPr>
         <w:t>CRM מודרני, לוגואים + מספרים קשיחים</w:t>
+      </w:r>
+    </w:p>
+    <w:p>
+      <w:pPr>
+        <w:bidi/>
+        <w:spacing w:after="60"/>
+        <w:jc w:val="right"/>
+      </w:pPr>
+      <w:r>
+        <w:t>🆕 מתג אוטונומיה: זיהוי 'עסקה מידרדרת' + פעולה — advisor/approve/autopilot. autopilot כותב next-step לבד (internal). ברירת מחדל advisor.</w:t>
       </w:r>
     </w:p>
     <w:p>

</xml_diff>

<commit_message>
docs(dashboards): reflect slipping-KPI alert + hub foundation across page + specs + xlsx
Co-Authored-By: Claude Opus 4.8 (1M context) <noreply@anthropic.com>
</commit_message>
<xml_diff>
--- a/HELIX SOFTWARES REVIEW PAGES.docx
+++ b/HELIX SOFTWARES REVIEW PAGES.docx
@@ -1040,6 +1040,16 @@
           <w:rtl/>
         </w:rPr>
         <w:t>HELIX DASHBOARDS   —   ציון כולל: 85/100</w:t>
+      </w:r>
+    </w:p>
+    <w:p>
+      <w:pPr>
+        <w:bidi/>
+        <w:spacing w:before="280" w:after="120"/>
+        <w:jc w:val="right"/>
+      </w:pPr>
+      <w:r>
+        <w:t>🆕 מתג אוטונומיה + התראת מדדים מידרדרים בדייג'סט (Von rule 3). תשתית hub מרכזי לקראת dispatch חוצה-מוצר.</w:t>
       </w:r>
     </w:p>
     <w:p>

</xml_diff>